<commit_message>
Auto-fill bảng động: ngành nghề, danh sách thành viên & cổ đông
- Thêm vòng lặp docxtemplater {#arr}...{/arr} vào hàng dữ liệu của bảng
  ngành nghề (pl1-1..5, pl2-1), danh sách thành viên (pl1-6), cổ đông (pl1-7)
- collectFormData() dựng mảng nganh/thanhvien/codong từ input
- Thêm name cho bảng cổ đông (Mẫu 7)

https://claude.ai/code/session_013nksCJ4hqSoqKyFSCvYMSU
</commit_message>
<xml_diff>
--- a/templates/pl1-1.docx
+++ b/templates/pl1-1.docx
@@ -2128,6 +2128,9 @@
                 <w:rFonts w:ascii="Arial" w:hAnsi="Arial" w:cs="Arial"/>
               </w:rPr>
             </w:pPr>
+            <w:r>
+              <w:t>{#nganh}{stt}</w:t>
+            </w:r>
           </w:p>
         </w:tc>
         <w:tc>
@@ -2143,6 +2146,9 @@
                 <w:rFonts w:ascii="Arial" w:hAnsi="Arial" w:cs="Arial"/>
               </w:rPr>
             </w:pPr>
+            <w:r>
+              <w:t>{ten}</w:t>
+            </w:r>
           </w:p>
         </w:tc>
         <w:tc>
@@ -2158,6 +2164,9 @@
                 <w:rFonts w:ascii="Arial" w:hAnsi="Arial" w:cs="Arial"/>
               </w:rPr>
             </w:pPr>
+            <w:r>
+              <w:t>{ma}</w:t>
+            </w:r>
           </w:p>
         </w:tc>
         <w:tc>
@@ -2173,6 +2182,9 @@
                 <w:rFonts w:ascii="Arial" w:hAnsi="Arial" w:cs="Arial"/>
               </w:rPr>
             </w:pPr>
+            <w:r>
+              <w:t>{chinh}{/nganh}</w:t>
+            </w:r>
           </w:p>
         </w:tc>
       </w:tr>

</xml_diff>